<commit_message>
Added AI QA CI/CD pipeline
</commit_message>
<xml_diff>
--- a/data/requirements/requirement.docx
+++ b/data/requirements/requirement.docx
@@ -3,69 +3,485 @@
 <w:document xmlns:wpc="http://schemas.microsoft.com/office/word/2010/wordprocessingCanvas" xmlns:cx="http://schemas.microsoft.com/office/drawing/2014/chartex" xmlns:cx1="http://schemas.microsoft.com/office/drawing/2015/9/8/chartex" xmlns:cx2="http://schemas.microsoft.com/office/drawing/2015/10/21/chartex" xmlns:cx3="http://schemas.microsoft.com/office/drawing/2016/5/9/chartex" xmlns:cx4="http://schemas.microsoft.com/office/drawing/2016/5/10/chartex" xmlns:cx5="http://schemas.microsoft.com/office/drawing/2016/5/11/chartex" xmlns:cx6="http://schemas.microsoft.com/office/drawing/2016/5/12/chartex" xmlns:cx7="http://schemas.microsoft.com/office/drawing/2016/5/13/chartex" xmlns:cx8="http://schemas.microsoft.com/office/drawing/2016/5/14/chartex" xmlns:mc="http://schemas.openxmlformats.org/markup-compatibility/2006" xmlns:aink="http://schemas.microsoft.com/office/drawing/2016/ink" xmlns:am3d="http://schemas.microsoft.com/office/drawing/2017/model3d" xmlns:o="urn:schemas-microsoft-com:office:office" xmlns:oel="http://schemas.microsoft.com/office/2019/extlst" xmlns:r="http://schemas.openxmlformats.org/officeDocument/2006/relationships" xmlns:m="http://schemas.openxmlformats.org/officeDocument/2006/math" xmlns:v="urn:schemas-microsoft-com:vml" xmlns:wp14="http://schemas.microsoft.com/office/word/2010/wordprocessingDrawing" xmlns:wp="http://schemas.openxmlformats.org/drawingml/2006/wordprocessingDrawing" xmlns:w10="urn:schemas-microsoft-com:office:word" xmlns:w="http://schemas.openxmlformats.org/wordprocessingml/2006/main" xmlns:w14="http://schemas.microsoft.com/office/word/2010/wordml" xmlns:w15="http://schemas.microsoft.com/office/word/2012/wordml" xmlns:w16cex="http://schemas.microsoft.com/office/word/2018/wordml/cex" xmlns:w16cid="http://schemas.microsoft.com/office/word/2016/wordml/cid" xmlns:w16="http://schemas.microsoft.com/office/word/2018/wordml" xmlns:w16du="http://schemas.microsoft.com/office/word/2023/wordml/word16du" xmlns:w16sdtdh="http://schemas.microsoft.com/office/word/2020/wordml/sdtdatahash" xmlns:w16sdtfl="http://schemas.microsoft.com/office/word/2024/wordml/sdtformatlock" xmlns:w16se="http://schemas.microsoft.com/office/word/2015/wordml/symex" xmlns:wpg="http://schemas.microsoft.com/office/word/2010/wordprocessingGroup" xmlns:wpi="http://schemas.microsoft.com/office/word/2010/wordprocessingInk" xmlns:wne="http://schemas.microsoft.com/office/word/2006/wordml" xmlns:wps="http://schemas.microsoft.com/office/word/2010/wordprocessingShape" mc:Ignorable="w14 w15 w16se w16cid w16 w16cex w16sdtdh w16sdtfl w16du wp14">
   <w:body>
     <w:p>
-      <w:r>
-        <w:t>Login Feature</w:t>
-      </w:r>
+      <w:pPr>
+        <w:rPr>
+          <w:b/>
+          <w:bCs/>
+        </w:rPr>
+      </w:pPr>
+      <w:r>
+        <w:rPr>
+          <w:b/>
+          <w:bCs/>
+        </w:rPr>
+        <w:t>High Level Design (HLD)</w:t>
+      </w:r>
+    </w:p>
+    <w:p>
+      <w:pPr>
+        <w:rPr>
+          <w:b/>
+          <w:bCs/>
+        </w:rPr>
+      </w:pPr>
+      <w:r>
+        <w:rPr>
+          <w:b/>
+          <w:bCs/>
+        </w:rPr>
+        <w:t>Architecture</w:t>
+      </w:r>
+    </w:p>
+    <w:p>
+      <w:r>
+        <w:t xml:space="preserve">The application follows a </w:t>
+      </w:r>
+      <w:r>
+        <w:rPr>
+          <w:b/>
+          <w:bCs/>
+        </w:rPr>
+        <w:t>3-tier architecture</w:t>
+      </w:r>
+      <w:r>
+        <w:t>.</w:t>
+      </w:r>
+    </w:p>
+    <w:p>
+      <w:r>
+        <w:t>Client Layer</w:t>
+      </w:r>
+      <w:r>
+        <w:br/>
+        <w:t>Web Application</w:t>
+      </w:r>
+      <w:r>
+        <w:br/>
+        <w:t>Backend API</w:t>
+      </w:r>
+      <w:r>
+        <w:br/>
+        <w:t>Database</w:t>
+      </w:r>
+    </w:p>
+    <w:p>
+      <w:r>
+        <w:pict w14:anchorId="0E3F33C9">
+          <v:rect id="_x0000_i1067" style="width:0;height:1.5pt" o:hralign="center" o:hrstd="t" o:hr="t" fillcolor="#a0a0a0" stroked="f"/>
+        </w:pict>
+      </w:r>
+    </w:p>
+    <w:p>
+      <w:pPr>
+        <w:rPr>
+          <w:b/>
+          <w:bCs/>
+        </w:rPr>
+      </w:pPr>
+      <w:r>
+        <w:rPr>
+          <w:b/>
+          <w:bCs/>
+        </w:rPr>
+        <w:t>Components</w:t>
+      </w:r>
+    </w:p>
+    <w:p>
+      <w:pPr>
+        <w:rPr>
+          <w:b/>
+          <w:bCs/>
+        </w:rPr>
+      </w:pPr>
+      <w:r>
+        <w:rPr>
+          <w:b/>
+          <w:bCs/>
+        </w:rPr>
+        <w:t>Login Page</w:t>
+      </w:r>
+    </w:p>
+    <w:p>
+      <w:r>
+        <w:t>Path:</w:t>
+      </w:r>
+    </w:p>
+    <w:p>
+      <w:r>
+        <w:t>/</w:t>
+      </w:r>
+      <w:proofErr w:type="gramStart"/>
+      <w:r>
+        <w:t>login</w:t>
+      </w:r>
+      <w:proofErr w:type="gramEnd"/>
+    </w:p>
+    <w:p>
+      <w:r>
+        <w:t>UI Elements:</w:t>
+      </w:r>
+    </w:p>
+    <w:p>
+      <w:r>
+        <w:t>Username field</w:t>
+      </w:r>
+      <w:r>
+        <w:br/>
+        <w:t>Password field</w:t>
+      </w:r>
+      <w:r>
+        <w:br/>
+        <w:t>Login button</w:t>
+      </w:r>
+      <w:r>
+        <w:br/>
+        <w:t>Error message area</w:t>
+      </w:r>
+    </w:p>
+    <w:p>
+      <w:r>
+        <w:pict w14:anchorId="29B266AF">
+          <v:rect id="_x0000_i1068" style="width:0;height:1.5pt" o:hralign="center" o:hrstd="t" o:hr="t" fillcolor="#a0a0a0" stroked="f"/>
+        </w:pict>
+      </w:r>
+    </w:p>
+    <w:p>
+      <w:pPr>
+        <w:rPr>
+          <w:b/>
+          <w:bCs/>
+        </w:rPr>
+      </w:pPr>
+      <w:r>
+        <w:rPr>
+          <w:b/>
+          <w:bCs/>
+        </w:rPr>
+        <w:t>Authentication Service</w:t>
+      </w:r>
+    </w:p>
+    <w:p>
+      <w:r>
+        <w:t>Responsibilities:</w:t>
+      </w:r>
+    </w:p>
+    <w:p>
+      <w:r>
+        <w:t>Validate username and password</w:t>
+      </w:r>
+      <w:r>
+        <w:br/>
+        <w:t>Check account status</w:t>
+      </w:r>
+      <w:r>
+        <w:br/>
+        <w:t>Track failed login attempts</w:t>
+      </w:r>
+      <w:r>
+        <w:br/>
+        <w:t>Lock account after threshold</w:t>
+      </w:r>
+    </w:p>
+    <w:p>
+      <w:r>
+        <w:pict w14:anchorId="3C1A180C">
+          <v:rect id="_x0000_i1069" style="width:0;height:1.5pt" o:hralign="center" o:hrstd="t" o:hr="t" fillcolor="#a0a0a0" stroked="f"/>
+        </w:pict>
+      </w:r>
+    </w:p>
+    <w:p>
+      <w:pPr>
+        <w:rPr>
+          <w:b/>
+          <w:bCs/>
+        </w:rPr>
+      </w:pPr>
+      <w:r>
+        <w:rPr>
+          <w:b/>
+          <w:bCs/>
+        </w:rPr>
+        <w:t>Dashboard Page</w:t>
+      </w:r>
+    </w:p>
+    <w:p>
+      <w:r>
+        <w:t>Path:</w:t>
+      </w:r>
+    </w:p>
+    <w:p>
+      <w:r>
+        <w:t>/</w:t>
+      </w:r>
+      <w:proofErr w:type="gramStart"/>
+      <w:r>
+        <w:t>dashboard</w:t>
+      </w:r>
+      <w:proofErr w:type="gramEnd"/>
+    </w:p>
+    <w:p>
+      <w:r>
+        <w:t>Components:</w:t>
+      </w:r>
+    </w:p>
+    <w:p>
+      <w:r>
+        <w:lastRenderedPageBreak/>
+        <w:t>User welcome banner</w:t>
+      </w:r>
+      <w:r>
+        <w:br/>
+        <w:t>Profile widget</w:t>
+      </w:r>
+      <w:r>
+        <w:br/>
+        <w:t>Logout button</w:t>
+      </w:r>
+    </w:p>
+    <w:p>
+      <w:r>
+        <w:pict w14:anchorId="50196158">
+          <v:rect id="_x0000_i1070" style="width:0;height:1.5pt" o:hralign="center" o:hrstd="t" o:hr="t" fillcolor="#a0a0a0" stroked="f"/>
+        </w:pict>
+      </w:r>
+    </w:p>
+    <w:p>
+      <w:pPr>
+        <w:rPr>
+          <w:b/>
+          <w:bCs/>
+        </w:rPr>
+      </w:pPr>
+      <w:r>
+        <w:rPr>
+          <w:b/>
+          <w:bCs/>
+        </w:rPr>
+        <w:t>Session Manager</w:t>
+      </w:r>
+    </w:p>
+    <w:p>
+      <w:r>
+        <w:t>Responsible for:</w:t>
+      </w:r>
+    </w:p>
+    <w:p>
+      <w:r>
+        <w:t>Create session after login</w:t>
+      </w:r>
+      <w:r>
+        <w:br/>
+        <w:t>Expire session after inactivity</w:t>
+      </w:r>
+      <w:r>
+        <w:br/>
+        <w:t>Destroy session during logout</w:t>
+      </w:r>
+    </w:p>
+    <w:p>
+      <w:r>
+        <w:pict w14:anchorId="78B856C4">
+          <v:rect id="_x0000_i1071" style="width:0;height:1.5pt" o:hralign="center" o:hrstd="t" o:hr="t" fillcolor="#a0a0a0" stroked="f"/>
+        </w:pict>
+      </w:r>
+    </w:p>
+    <w:p>
+      <w:pPr>
+        <w:rPr>
+          <w:b/>
+          <w:bCs/>
+        </w:rPr>
+      </w:pPr>
+      <w:r>
+        <w:rPr>
+          <w:b/>
+          <w:bCs/>
+        </w:rPr>
+        <w:t>API Endpoints</w:t>
+      </w:r>
+    </w:p>
+    <w:p>
+      <w:pPr>
+        <w:rPr>
+          <w:b/>
+          <w:bCs/>
+        </w:rPr>
+      </w:pPr>
+      <w:r>
+        <w:rPr>
+          <w:b/>
+          <w:bCs/>
+        </w:rPr>
+        <w:t>Login API</w:t>
+      </w:r>
+    </w:p>
+    <w:p>
+      <w:r>
+        <w:t>POST /</w:t>
+      </w:r>
+      <w:proofErr w:type="spellStart"/>
+      <w:r>
+        <w:t>api</w:t>
+      </w:r>
+      <w:proofErr w:type="spellEnd"/>
+      <w:r>
+        <w:t>/login</w:t>
+      </w:r>
+    </w:p>
+    <w:p>
+      <w:r>
+        <w:t>Request</w:t>
+      </w:r>
+    </w:p>
+    <w:p>
+      <w:r>
+        <w:t>{</w:t>
+      </w:r>
+      <w:r>
+        <w:br/>
+        <w:t xml:space="preserve">  "username": "user1",</w:t>
+      </w:r>
+      <w:r>
+        <w:br/>
+        <w:t xml:space="preserve">  "password": "password123"</w:t>
+      </w:r>
+      <w:r>
+        <w:br/>
+        <w:t>}</w:t>
+      </w:r>
+    </w:p>
+    <w:p>
+      <w:r>
+        <w:t>Response</w:t>
+      </w:r>
+    </w:p>
+    <w:p>
+      <w:r>
+        <w:t>{</w:t>
+      </w:r>
+      <w:r>
+        <w:br/>
+        <w:t xml:space="preserve">  "status": "success",</w:t>
+      </w:r>
+      <w:r>
+        <w:br/>
+        <w:t xml:space="preserve">  "token": "JWT_TOKEN"</w:t>
+      </w:r>
+      <w:r>
+        <w:br/>
+        <w:t>}</w:t>
+      </w:r>
+    </w:p>
+    <w:p>
+      <w:r>
+        <w:pict w14:anchorId="52E58953">
+          <v:rect id="_x0000_i1072" style="width:0;height:1.5pt" o:hralign="center" o:hrstd="t" o:hr="t" fillcolor="#a0a0a0" stroked="f"/>
+        </w:pict>
+      </w:r>
+    </w:p>
+    <w:p>
+      <w:pPr>
+        <w:rPr>
+          <w:b/>
+          <w:bCs/>
+        </w:rPr>
+      </w:pPr>
+      <w:r>
+        <w:rPr>
+          <w:b/>
+          <w:bCs/>
+        </w:rPr>
+        <w:t>Logout API</w:t>
+      </w:r>
+    </w:p>
+    <w:p>
+      <w:r>
+        <w:t>POST /</w:t>
+      </w:r>
+      <w:proofErr w:type="spellStart"/>
+      <w:r>
+        <w:t>api</w:t>
+      </w:r>
+      <w:proofErr w:type="spellEnd"/>
+      <w:r>
+        <w:t>/logout</w:t>
+      </w:r>
+    </w:p>
+    <w:p>
+      <w:r>
+        <w:pict w14:anchorId="4AD21330">
+          <v:rect id="_x0000_i1073" style="width:0;height:1.5pt" o:hralign="center" o:hrstd="t" o:hr="t" fillcolor="#a0a0a0" stroked="f"/>
+        </w:pict>
+      </w:r>
+    </w:p>
+    <w:p>
+      <w:pPr>
+        <w:rPr>
+          <w:b/>
+          <w:bCs/>
+        </w:rPr>
+      </w:pPr>
+      <w:r>
+        <w:rPr>
+          <w:b/>
+          <w:bCs/>
+        </w:rPr>
+        <w:t>Database Tables</w:t>
+      </w:r>
+    </w:p>
+    <w:p>
+      <w:pPr>
+        <w:rPr>
+          <w:b/>
+          <w:bCs/>
+        </w:rPr>
+      </w:pPr>
+      <w:r>
+        <w:rPr>
+          <w:b/>
+          <w:bCs/>
+        </w:rPr>
+        <w:t>Users Table</w:t>
+      </w:r>
+    </w:p>
+    <w:p>
+      <w:r>
+        <w:lastRenderedPageBreak/>
+        <w:t>Fields:</w:t>
+      </w:r>
+    </w:p>
+    <w:p>
+      <w:proofErr w:type="spellStart"/>
+      <w:r>
+        <w:t>user_id</w:t>
+      </w:r>
+      <w:proofErr w:type="spellEnd"/>
+      <w:r>
+        <w:br/>
+        <w:t>username</w:t>
+      </w:r>
+      <w:r>
+        <w:br/>
+        <w:t>password</w:t>
+      </w:r>
+      <w:r>
+        <w:br/>
+      </w:r>
+      <w:proofErr w:type="spellStart"/>
+      <w:r>
+        <w:t>account_status</w:t>
+      </w:r>
+      <w:proofErr w:type="spellEnd"/>
+      <w:r>
+        <w:br/>
+      </w:r>
+      <w:proofErr w:type="spellStart"/>
+      <w:r>
+        <w:t>failed_attempts</w:t>
+      </w:r>
+      <w:proofErr w:type="spellEnd"/>
     </w:p>
     <w:p/>
-    <w:p>
-      <w:proofErr w:type="gramStart"/>
-      <w:r>
-        <w:t>User</w:t>
-      </w:r>
-      <w:proofErr w:type="gramEnd"/>
-      <w:r>
-        <w:t xml:space="preserve"> should login using username and password.</w:t>
-      </w:r>
-    </w:p>
-    <w:p/>
-    <w:p>
-      <w:r>
-        <w:t>Validations:</w:t>
-      </w:r>
-    </w:p>
-    <w:p/>
-    <w:p>
-      <w:r>
-        <w:t>1. Valid credentials should login successfully</w:t>
-      </w:r>
-    </w:p>
-    <w:p>
-      <w:r>
-        <w:t xml:space="preserve">2. Invalid </w:t>
-      </w:r>
-      <w:proofErr w:type="gramStart"/>
-      <w:r>
-        <w:t>password</w:t>
-      </w:r>
-      <w:proofErr w:type="gramEnd"/>
-      <w:r>
-        <w:t xml:space="preserve"> should return authentication error</w:t>
-      </w:r>
-    </w:p>
-    <w:p>
-      <w:r>
-        <w:t xml:space="preserve">3. Empty </w:t>
-      </w:r>
-      <w:proofErr w:type="gramStart"/>
-      <w:r>
-        <w:t>username</w:t>
-      </w:r>
-      <w:proofErr w:type="gramEnd"/>
-      <w:r>
-        <w:t xml:space="preserve"> should return validation </w:t>
-      </w:r>
-      <w:proofErr w:type="gramStart"/>
-      <w:r>
-        <w:t>error</w:t>
-      </w:r>
-      <w:proofErr w:type="gramEnd"/>
-    </w:p>
-    <w:p>
-      <w:r>
-        <w:t>4. Locked account should not login</w:t>
-      </w:r>
-    </w:p>
     <w:sectPr>
       <w:pgSz w:w="12240" w:h="15840"/>
       <w:pgMar w:top="1440" w:right="1440" w:bottom="1440" w:left="1440" w:header="720" w:footer="720" w:gutter="0"/>
@@ -484,7 +900,7 @@
     <w:link w:val="Heading1Char"/>
     <w:uiPriority w:val="9"/>
     <w:qFormat/>
-    <w:rsid w:val="004F5C9B"/>
+    <w:rsid w:val="004500FB"/>
     <w:pPr>
       <w:keepNext/>
       <w:keepLines/>
@@ -507,7 +923,7 @@
     <w:semiHidden/>
     <w:unhideWhenUsed/>
     <w:qFormat/>
-    <w:rsid w:val="004F5C9B"/>
+    <w:rsid w:val="004500FB"/>
     <w:pPr>
       <w:keepNext/>
       <w:keepLines/>
@@ -530,7 +946,7 @@
     <w:semiHidden/>
     <w:unhideWhenUsed/>
     <w:qFormat/>
-    <w:rsid w:val="004F5C9B"/>
+    <w:rsid w:val="004500FB"/>
     <w:pPr>
       <w:keepNext/>
       <w:keepLines/>
@@ -553,7 +969,7 @@
     <w:semiHidden/>
     <w:unhideWhenUsed/>
     <w:qFormat/>
-    <w:rsid w:val="004F5C9B"/>
+    <w:rsid w:val="004500FB"/>
     <w:pPr>
       <w:keepNext/>
       <w:keepLines/>
@@ -576,7 +992,7 @@
     <w:semiHidden/>
     <w:unhideWhenUsed/>
     <w:qFormat/>
-    <w:rsid w:val="004F5C9B"/>
+    <w:rsid w:val="004500FB"/>
     <w:pPr>
       <w:keepNext/>
       <w:keepLines/>
@@ -597,7 +1013,7 @@
     <w:semiHidden/>
     <w:unhideWhenUsed/>
     <w:qFormat/>
-    <w:rsid w:val="004F5C9B"/>
+    <w:rsid w:val="004500FB"/>
     <w:pPr>
       <w:keepNext/>
       <w:keepLines/>
@@ -620,7 +1036,7 @@
     <w:semiHidden/>
     <w:unhideWhenUsed/>
     <w:qFormat/>
-    <w:rsid w:val="004F5C9B"/>
+    <w:rsid w:val="004500FB"/>
     <w:pPr>
       <w:keepNext/>
       <w:keepLines/>
@@ -641,7 +1057,7 @@
     <w:semiHidden/>
     <w:unhideWhenUsed/>
     <w:qFormat/>
-    <w:rsid w:val="004F5C9B"/>
+    <w:rsid w:val="004500FB"/>
     <w:pPr>
       <w:keepNext/>
       <w:keepLines/>
@@ -664,7 +1080,7 @@
     <w:semiHidden/>
     <w:unhideWhenUsed/>
     <w:qFormat/>
-    <w:rsid w:val="004F5C9B"/>
+    <w:rsid w:val="004500FB"/>
     <w:pPr>
       <w:keepNext/>
       <w:keepLines/>
@@ -679,7 +1095,6 @@
   <w:style w:type="character" w:default="1" w:styleId="DefaultParagraphFont">
     <w:name w:val="Default Paragraph Font"/>
     <w:uiPriority w:val="1"/>
-    <w:semiHidden/>
     <w:unhideWhenUsed/>
   </w:style>
   <w:style w:type="table" w:default="1" w:styleId="TableNormal">
@@ -708,7 +1123,7 @@
     <w:basedOn w:val="DefaultParagraphFont"/>
     <w:link w:val="Heading1"/>
     <w:uiPriority w:val="9"/>
-    <w:rsid w:val="004F5C9B"/>
+    <w:rsid w:val="004500FB"/>
     <w:rPr>
       <w:rFonts w:asciiTheme="majorHAnsi" w:eastAsiaTheme="majorEastAsia" w:hAnsiTheme="majorHAnsi" w:cstheme="majorBidi"/>
       <w:color w:val="0F4761" w:themeColor="accent1" w:themeShade="BF"/>
@@ -722,7 +1137,7 @@
     <w:link w:val="Heading2"/>
     <w:uiPriority w:val="9"/>
     <w:semiHidden/>
-    <w:rsid w:val="004F5C9B"/>
+    <w:rsid w:val="004500FB"/>
     <w:rPr>
       <w:rFonts w:asciiTheme="majorHAnsi" w:eastAsiaTheme="majorEastAsia" w:hAnsiTheme="majorHAnsi" w:cstheme="majorBidi"/>
       <w:color w:val="0F4761" w:themeColor="accent1" w:themeShade="BF"/>
@@ -736,7 +1151,7 @@
     <w:link w:val="Heading3"/>
     <w:uiPriority w:val="9"/>
     <w:semiHidden/>
-    <w:rsid w:val="004F5C9B"/>
+    <w:rsid w:val="004500FB"/>
     <w:rPr>
       <w:rFonts w:eastAsiaTheme="majorEastAsia" w:cstheme="majorBidi"/>
       <w:color w:val="0F4761" w:themeColor="accent1" w:themeShade="BF"/>
@@ -750,7 +1165,7 @@
     <w:link w:val="Heading4"/>
     <w:uiPriority w:val="9"/>
     <w:semiHidden/>
-    <w:rsid w:val="004F5C9B"/>
+    <w:rsid w:val="004500FB"/>
     <w:rPr>
       <w:rFonts w:eastAsiaTheme="majorEastAsia" w:cstheme="majorBidi"/>
       <w:i/>
@@ -764,7 +1179,7 @@
     <w:link w:val="Heading5"/>
     <w:uiPriority w:val="9"/>
     <w:semiHidden/>
-    <w:rsid w:val="004F5C9B"/>
+    <w:rsid w:val="004500FB"/>
     <w:rPr>
       <w:rFonts w:eastAsiaTheme="majorEastAsia" w:cstheme="majorBidi"/>
       <w:color w:val="0F4761" w:themeColor="accent1" w:themeShade="BF"/>
@@ -776,7 +1191,7 @@
     <w:link w:val="Heading6"/>
     <w:uiPriority w:val="9"/>
     <w:semiHidden/>
-    <w:rsid w:val="004F5C9B"/>
+    <w:rsid w:val="004500FB"/>
     <w:rPr>
       <w:rFonts w:eastAsiaTheme="majorEastAsia" w:cstheme="majorBidi"/>
       <w:i/>
@@ -790,7 +1205,7 @@
     <w:link w:val="Heading7"/>
     <w:uiPriority w:val="9"/>
     <w:semiHidden/>
-    <w:rsid w:val="004F5C9B"/>
+    <w:rsid w:val="004500FB"/>
     <w:rPr>
       <w:rFonts w:eastAsiaTheme="majorEastAsia" w:cstheme="majorBidi"/>
       <w:color w:val="595959" w:themeColor="text1" w:themeTint="A6"/>
@@ -802,7 +1217,7 @@
     <w:link w:val="Heading8"/>
     <w:uiPriority w:val="9"/>
     <w:semiHidden/>
-    <w:rsid w:val="004F5C9B"/>
+    <w:rsid w:val="004500FB"/>
     <w:rPr>
       <w:rFonts w:eastAsiaTheme="majorEastAsia" w:cstheme="majorBidi"/>
       <w:i/>
@@ -816,7 +1231,7 @@
     <w:link w:val="Heading9"/>
     <w:uiPriority w:val="9"/>
     <w:semiHidden/>
-    <w:rsid w:val="004F5C9B"/>
+    <w:rsid w:val="004500FB"/>
     <w:rPr>
       <w:rFonts w:eastAsiaTheme="majorEastAsia" w:cstheme="majorBidi"/>
       <w:color w:val="272727" w:themeColor="text1" w:themeTint="D8"/>
@@ -829,7 +1244,7 @@
     <w:link w:val="TitleChar"/>
     <w:uiPriority w:val="10"/>
     <w:qFormat/>
-    <w:rsid w:val="004F5C9B"/>
+    <w:rsid w:val="004500FB"/>
     <w:pPr>
       <w:spacing w:after="80" w:line="240" w:lineRule="auto"/>
       <w:contextualSpacing/>
@@ -847,7 +1262,7 @@
     <w:basedOn w:val="DefaultParagraphFont"/>
     <w:link w:val="Title"/>
     <w:uiPriority w:val="10"/>
-    <w:rsid w:val="004F5C9B"/>
+    <w:rsid w:val="004500FB"/>
     <w:rPr>
       <w:rFonts w:asciiTheme="majorHAnsi" w:eastAsiaTheme="majorEastAsia" w:hAnsiTheme="majorHAnsi" w:cstheme="majorBidi"/>
       <w:spacing w:val="-10"/>
@@ -863,7 +1278,7 @@
     <w:link w:val="SubtitleChar"/>
     <w:uiPriority w:val="11"/>
     <w:qFormat/>
-    <w:rsid w:val="004F5C9B"/>
+    <w:rsid w:val="004500FB"/>
     <w:pPr>
       <w:numPr>
         <w:ilvl w:val="1"/>
@@ -882,7 +1297,7 @@
     <w:basedOn w:val="DefaultParagraphFont"/>
     <w:link w:val="Subtitle"/>
     <w:uiPriority w:val="11"/>
-    <w:rsid w:val="004F5C9B"/>
+    <w:rsid w:val="004500FB"/>
     <w:rPr>
       <w:rFonts w:eastAsiaTheme="majorEastAsia" w:cstheme="majorBidi"/>
       <w:color w:val="595959" w:themeColor="text1" w:themeTint="A6"/>
@@ -898,7 +1313,7 @@
     <w:link w:val="QuoteChar"/>
     <w:uiPriority w:val="29"/>
     <w:qFormat/>
-    <w:rsid w:val="004F5C9B"/>
+    <w:rsid w:val="004500FB"/>
     <w:pPr>
       <w:spacing w:before="160"/>
       <w:jc w:val="center"/>
@@ -914,7 +1329,7 @@
     <w:basedOn w:val="DefaultParagraphFont"/>
     <w:link w:val="Quote"/>
     <w:uiPriority w:val="29"/>
-    <w:rsid w:val="004F5C9B"/>
+    <w:rsid w:val="004500FB"/>
     <w:rPr>
       <w:i/>
       <w:iCs/>
@@ -926,7 +1341,7 @@
     <w:basedOn w:val="Normal"/>
     <w:uiPriority w:val="34"/>
     <w:qFormat/>
-    <w:rsid w:val="004F5C9B"/>
+    <w:rsid w:val="004500FB"/>
     <w:pPr>
       <w:ind w:left="720"/>
       <w:contextualSpacing/>
@@ -937,7 +1352,7 @@
     <w:basedOn w:val="DefaultParagraphFont"/>
     <w:uiPriority w:val="21"/>
     <w:qFormat/>
-    <w:rsid w:val="004F5C9B"/>
+    <w:rsid w:val="004500FB"/>
     <w:rPr>
       <w:i/>
       <w:iCs/>
@@ -951,7 +1366,7 @@
     <w:link w:val="IntenseQuoteChar"/>
     <w:uiPriority w:val="30"/>
     <w:qFormat/>
-    <w:rsid w:val="004F5C9B"/>
+    <w:rsid w:val="004500FB"/>
     <w:pPr>
       <w:pBdr>
         <w:top w:val="single" w:sz="4" w:space="10" w:color="0F4761" w:themeColor="accent1" w:themeShade="BF"/>
@@ -972,7 +1387,7 @@
     <w:basedOn w:val="DefaultParagraphFont"/>
     <w:link w:val="IntenseQuote"/>
     <w:uiPriority w:val="30"/>
-    <w:rsid w:val="004F5C9B"/>
+    <w:rsid w:val="004500FB"/>
     <w:rPr>
       <w:i/>
       <w:iCs/>
@@ -984,7 +1399,7 @@
     <w:basedOn w:val="DefaultParagraphFont"/>
     <w:uiPriority w:val="32"/>
     <w:qFormat/>
-    <w:rsid w:val="004F5C9B"/>
+    <w:rsid w:val="004500FB"/>
     <w:rPr>
       <w:b/>
       <w:bCs/>

</xml_diff>